<commit_message>
Member tasks run only on the synthetic test corridor
Medenilla's Part 2 now uses the three test-corridor disturbance results
(degradation vs the noise10 baseline) instead of the Route 801 baselines, so no
member task touches the CapMetro dataset. Route 801 statistics stay with Jared.

Co-Authored-By: Claude Opus 5.5 <noreply@anthropic.com>
</commit_message>
<xml_diff>
--- a/docs/msa3_member_guides/1_Medenilla_Statistics/B3_Guide_Statistics.docx
+++ b/docs/msa3_member_guides/1_Medenilla_Statistics/B3_Guide_Statistics.docx
@@ -3090,7 +3090,7 @@
           <w:color w:val="1F3B63"/>
           <w:sz w:val="30"/>
         </w:rPr>
-        <w:t>6. Part 2 (after 12 October): the Route 801 numbers</w:t>
+        <w:t>6. Part 2 (after 2 November): the disturbance results</w:t>
       </w:r>
     </w:p>
     <w:p>
@@ -3105,7 +3105,7 @@
           <w:color w:val="1F2933"/>
           <w:sz w:val="22"/>
         </w:rPr>
-        <w:t xml:space="preserve">Jared is re-running the Route 801 baselines on the fixed simulator. When he sends you </w:t>
+        <w:t xml:space="preserve">Badal (surge), Lopez (weather) and Marquez (breakdown) run their disturbances on the same test corridor and hand in </w:t>
       </w:r>
       <w:r>
         <w:rPr>
@@ -3115,7 +3115,7 @@
           <w:color w:val="2E4B73"/>
           <w:sz w:val="19"/>
         </w:rPr>
-        <w:t>mc_results.csv</w:t>
+        <w:t>disturbance_runs.csv</w:t>
       </w:r>
       <w:r>
         <w:rPr>
@@ -3125,7 +3125,27 @@
           <w:color w:val="1F2933"/>
           <w:sz w:val="22"/>
         </w:rPr>
-        <w:t>, run the same steps on it, with three changes:</w:t>
+        <w:t xml:space="preserve">, plus the shared baseline </w:t>
+      </w:r>
+      <w:r>
+        <w:rPr>
+          <w:rFonts w:ascii="Consolas" w:hAnsi="Consolas" w:cs="Consolas" w:eastAsia="Consolas"/>
+          <w:b w:val="0"/>
+          <w:i w:val="0"/>
+          <w:color w:val="2E4B73"/>
+          <w:sz w:val="19"/>
+        </w:rPr>
+        <w:t>baseline_v2_runs.csv</w:t>
+      </w:r>
+      <w:r>
+        <w:rPr>
+          <w:rFonts w:ascii="Calibri" w:hAnsi="Calibri" w:cs="Calibri" w:eastAsia="Calibri"/>
+          <w:b w:val="0"/>
+          <w:i w:val="0"/>
+          <w:color w:val="1F2933"/>
+          <w:sz w:val="22"/>
+        </w:rPr>
+        <w:t>. Nothing here uses the CapMetro dataset: it is all the synthetic test corridor. Run the same steps, with three changes:</w:t>
       </w:r>
     </w:p>
     <w:p>
@@ -3151,7 +3171,7 @@
           <w:color w:val="1F2933"/>
           <w:sz w:val="22"/>
         </w:rPr>
-        <w:t xml:space="preserve">The cell column is called </w:t>
+        <w:t xml:space="preserve">Stack the baseline file and the three disturbance files into one table. Keep only </w:t>
       </w:r>
       <w:r>
         <w:rPr>
@@ -3161,7 +3181,7 @@
           <w:color w:val="2E4B73"/>
           <w:sz w:val="19"/>
         </w:rPr>
-        <w:t>scenario</w:t>
+        <w:t>experiment</w:t>
       </w:r>
       <w:r>
         <w:rPr>
@@ -3171,7 +3191,147 @@
           <w:color w:val="1F2933"/>
           <w:sz w:val="22"/>
         </w:rPr>
-        <w:t xml:space="preserve"> (Stage A, the three single-disturbance ablations, Stage B). Do every scenario separately.</w:t>
+        <w:t xml:space="preserve"> = </w:t>
+      </w:r>
+      <w:r>
+        <w:rPr>
+          <w:rFonts w:ascii="Consolas" w:hAnsi="Consolas" w:cs="Consolas" w:eastAsia="Consolas"/>
+          <w:b w:val="0"/>
+          <w:i w:val="0"/>
+          <w:color w:val="2E4B73"/>
+          <w:sz w:val="19"/>
+        </w:rPr>
+        <w:t>E3</w:t>
+      </w:r>
+      <w:r>
+        <w:rPr>
+          <w:rFonts w:ascii="Calibri" w:hAnsi="Calibri" w:cs="Calibri" w:eastAsia="Calibri"/>
+          <w:b w:val="0"/>
+          <w:i w:val="0"/>
+          <w:color w:val="1F2933"/>
+          <w:sz w:val="22"/>
+        </w:rPr>
+        <w:t xml:space="preserve">. The </w:t>
+      </w:r>
+      <w:r>
+        <w:rPr>
+          <w:rFonts w:ascii="Calibri" w:hAnsi="Calibri" w:cs="Calibri" w:eastAsia="Calibri"/>
+          <w:b/>
+          <w:i w:val="0"/>
+          <w:color w:val="1F2933"/>
+          <w:sz w:val="22"/>
+        </w:rPr>
+        <w:t>cell</w:t>
+      </w:r>
+      <w:r>
+        <w:rPr>
+          <w:rFonts w:ascii="Calibri" w:hAnsi="Calibri" w:cs="Calibri" w:eastAsia="Calibri"/>
+          <w:b w:val="0"/>
+          <w:i w:val="0"/>
+          <w:color w:val="1F2933"/>
+          <w:sz w:val="22"/>
+        </w:rPr>
+        <w:t xml:space="preserve"> is now the </w:t>
+      </w:r>
+      <w:r>
+        <w:rPr>
+          <w:rFonts w:ascii="Consolas" w:hAnsi="Consolas" w:cs="Consolas" w:eastAsia="Consolas"/>
+          <w:b w:val="0"/>
+          <w:i w:val="0"/>
+          <w:color w:val="2E4B73"/>
+          <w:sz w:val="19"/>
+        </w:rPr>
+        <w:t>setting</w:t>
+      </w:r>
+      <w:r>
+        <w:rPr>
+          <w:rFonts w:ascii="Calibri" w:hAnsi="Calibri" w:cs="Calibri" w:eastAsia="Calibri"/>
+          <w:b w:val="0"/>
+          <w:i w:val="0"/>
+          <w:color w:val="1F2933"/>
+          <w:sz w:val="22"/>
+        </w:rPr>
+        <w:t xml:space="preserve"> column: </w:t>
+      </w:r>
+      <w:r>
+        <w:rPr>
+          <w:rFonts w:ascii="Consolas" w:hAnsi="Consolas" w:cs="Consolas" w:eastAsia="Consolas"/>
+          <w:b w:val="0"/>
+          <w:i w:val="0"/>
+          <w:color w:val="2E4B73"/>
+          <w:sz w:val="19"/>
+        </w:rPr>
+        <w:t>noise10</w:t>
+      </w:r>
+      <w:r>
+        <w:rPr>
+          <w:rFonts w:ascii="Calibri" w:hAnsi="Calibri" w:cs="Calibri" w:eastAsia="Calibri"/>
+          <w:b w:val="0"/>
+          <w:i w:val="0"/>
+          <w:color w:val="1F2933"/>
+          <w:sz w:val="22"/>
+        </w:rPr>
+        <w:t xml:space="preserve"> is the baseline, and the others are the disturbance levels (e.g. </w:t>
+      </w:r>
+      <w:r>
+        <w:rPr>
+          <w:rFonts w:ascii="Consolas" w:hAnsi="Consolas" w:cs="Consolas" w:eastAsia="Consolas"/>
+          <w:b w:val="0"/>
+          <w:i w:val="0"/>
+          <w:color w:val="2E4B73"/>
+          <w:sz w:val="19"/>
+        </w:rPr>
+        <w:t>global_sd1</w:t>
+      </w:r>
+      <w:r>
+        <w:rPr>
+          <w:rFonts w:ascii="Calibri" w:hAnsi="Calibri" w:cs="Calibri" w:eastAsia="Calibri"/>
+          <w:b w:val="0"/>
+          <w:i w:val="0"/>
+          <w:color w:val="1F2933"/>
+          <w:sz w:val="22"/>
+        </w:rPr>
+        <w:t xml:space="preserve">, </w:t>
+      </w:r>
+      <w:r>
+        <w:rPr>
+          <w:rFonts w:ascii="Consolas" w:hAnsi="Consolas" w:cs="Consolas" w:eastAsia="Consolas"/>
+          <w:b w:val="0"/>
+          <w:i w:val="0"/>
+          <w:color w:val="2E4B73"/>
+          <w:sz w:val="19"/>
+        </w:rPr>
+        <w:t>w075</w:t>
+      </w:r>
+      <w:r>
+        <w:rPr>
+          <w:rFonts w:ascii="Calibri" w:hAnsi="Calibri" w:cs="Calibri" w:eastAsia="Calibri"/>
+          <w:b w:val="0"/>
+          <w:i w:val="0"/>
+          <w:color w:val="1F2933"/>
+          <w:sz w:val="22"/>
+        </w:rPr>
+        <w:t xml:space="preserve">, </w:t>
+      </w:r>
+      <w:r>
+        <w:rPr>
+          <w:rFonts w:ascii="Consolas" w:hAnsi="Consolas" w:cs="Consolas" w:eastAsia="Consolas"/>
+          <w:b w:val="0"/>
+          <w:i w:val="0"/>
+          <w:color w:val="2E4B73"/>
+          <w:sz w:val="19"/>
+        </w:rPr>
+        <w:t>B1</w:t>
+      </w:r>
+      <w:r>
+        <w:rPr>
+          <w:rFonts w:ascii="Calibri" w:hAnsi="Calibri" w:cs="Calibri" w:eastAsia="Calibri"/>
+          <w:b w:val="0"/>
+          <w:i w:val="0"/>
+          <w:color w:val="1F2933"/>
+          <w:sz w:val="22"/>
+        </w:rPr>
+        <w:t>). Run Steps 1–6 for every setting separately.</w:t>
       </w:r>
     </w:p>
     <w:p>
@@ -3207,7 +3367,7 @@
           <w:color w:val="2E4B73"/>
           <w:sz w:val="19"/>
         </w:rPr>
-        <w:t>headway_cv</w:t>
+        <w:t>cv</w:t>
       </w:r>
       <w:r>
         <w:rPr>
@@ -3227,7 +3387,7 @@
           <w:color w:val="2E4B73"/>
           <w:sz w:val="19"/>
         </w:rPr>
-        <w:t>wait_direct</w:t>
+        <w:t>wait_s</w:t>
       </w:r>
       <w:r>
         <w:rPr>
@@ -3237,7 +3397,7 @@
           <w:color w:val="1F2933"/>
           <w:sz w:val="22"/>
         </w:rPr>
-        <w:t xml:space="preserve"> (the recorded waiting time, our main measure) and </w:t>
+        <w:t xml:space="preserve"> and </w:t>
       </w:r>
       <w:r>
         <w:rPr>
@@ -3257,7 +3417,7 @@
           <w:color w:val="1F2933"/>
           <w:sz w:val="22"/>
         </w:rPr>
-        <w:t>.</w:t>
+        <w:t>, as in Part 1.</w:t>
       </w:r>
     </w:p>
     <w:p>
@@ -3303,7 +3463,27 @@
           <w:color w:val="1F2933"/>
           <w:sz w:val="22"/>
         </w:rPr>
-        <w:t xml:space="preserve">: for each controller and metric, divide the mean in a disturbed scenario by the mean in Stage A. A ratio of 1.10 means 10% worse under that disturbance. Make its 95% CI with the bootstrap, but </w:t>
+        <w:t xml:space="preserve">: for each controller and metric, divide the mean in a disturbance setting by the mean in </w:t>
+      </w:r>
+      <w:r>
+        <w:rPr>
+          <w:rFonts w:ascii="Consolas" w:hAnsi="Consolas" w:cs="Consolas" w:eastAsia="Consolas"/>
+          <w:b w:val="0"/>
+          <w:i w:val="0"/>
+          <w:color w:val="2E4B73"/>
+          <w:sz w:val="19"/>
+        </w:rPr>
+        <w:t>noise10</w:t>
+      </w:r>
+      <w:r>
+        <w:rPr>
+          <w:rFonts w:ascii="Calibri" w:hAnsi="Calibri" w:cs="Calibri" w:eastAsia="Calibri"/>
+          <w:b w:val="0"/>
+          <w:i w:val="0"/>
+          <w:color w:val="1F2933"/>
+          <w:sz w:val="22"/>
+        </w:rPr>
+        <w:t xml:space="preserve">. A ratio of 1.10 means 10% worse under that disturbance. Make its 95% CI with the bootstrap, but </w:t>
       </w:r>
       <w:r>
         <w:rPr>
@@ -3313,7 +3493,7 @@
           <w:color w:val="1F2933"/>
           <w:sz w:val="22"/>
         </w:rPr>
-        <w:t>resample the two scenarios separately</w:t>
+        <w:t>resample the two settings separately</w:t>
       </w:r>
       <w:r>
         <w:rPr>
@@ -3343,7 +3523,7 @@
           <w:color w:val="1F2933"/>
           <w:sz w:val="22"/>
         </w:rPr>
-        <w:t xml:space="preserve">, one draw for the Stage A seeds and one for the disturbed seeds). Save as </w:t>
+        <w:t xml:space="preserve">: one draw for the baseline seeds, one for the disturbance seeds). Save as </w:t>
       </w:r>
       <w:r>
         <w:rPr>
@@ -3396,7 +3576,7 @@
           <w:color w:val="555555"/>
           <w:sz w:val="20"/>
         </w:rPr>
-        <w:t>Manuscript §3.2.9 pp.53–54: degradation relative to the same controller's Stage A, with bootstrap intervals; unpaired comparison across disturbance levels. This is EO 3.2.</w:t>
+        <w:t>Manuscript §3.2.9 pp.53–54: degradation relative to the same controller's undisturbed result, with bootstrap intervals; unpaired comparison across disturbance levels. This is EO 3.2.</w:t>
       </w:r>
     </w:p>
     <w:p>
@@ -3411,7 +3591,7 @@
           <w:color w:val="1F2933"/>
           <w:sz w:val="22"/>
         </w:rPr>
-        <w:t>Later, the same script runs on the three disturbance results from Badal, Lopez and Marquez, and on the final MARL results. Write it so the input file name and the metric names are set at the top.</w:t>
+        <w:t>Jared runs your script on the Route 801 results and, later, on the final MARL results. So write it so the input file names, the cell column and the metric names are set at the top.</w:t>
       </w:r>
     </w:p>
     <w:p>
@@ -3569,7 +3749,7 @@
           <w:color w:val="1F2933"/>
           <w:sz w:val="22"/>
         </w:rPr>
-        <w:t>Part 2 (when the Route 801 file arrives):</w:t>
+        <w:t>Part 2 (about 3–9 November, when the disturbance results arrive):</w:t>
       </w:r>
       <w:r>
         <w:rPr>
@@ -3579,7 +3759,27 @@
           <w:color w:val="1F2933"/>
           <w:sz w:val="22"/>
         </w:rPr>
-        <w:t xml:space="preserve"> the same folder, with three more CSVs.</w:t>
+        <w:t xml:space="preserve"> the same folder, with the outputs for every setting plus </w:t>
+      </w:r>
+      <w:r>
+        <w:rPr>
+          <w:rFonts w:ascii="Consolas" w:hAnsi="Consolas" w:cs="Consolas" w:eastAsia="Consolas"/>
+          <w:b w:val="0"/>
+          <w:i w:val="0"/>
+          <w:color w:val="2E4B73"/>
+          <w:sz w:val="19"/>
+        </w:rPr>
+        <w:t>stats_degradation.csv</w:t>
+      </w:r>
+      <w:r>
+        <w:rPr>
+          <w:rFonts w:ascii="Calibri" w:hAnsi="Calibri" w:cs="Calibri" w:eastAsia="Calibri"/>
+          <w:b w:val="0"/>
+          <w:i w:val="0"/>
+          <w:color w:val="1F2933"/>
+          <w:sz w:val="22"/>
+        </w:rPr>
+        <w:t>.</w:t>
       </w:r>
     </w:p>
     <w:p>

</xml_diff>

<commit_message>
Guides: pin SUMO 1.27.1 and SciPy >= 1.11, exact bootstrap order, time-space and degradation figures
Fixes found in a final check of the four MSA 3 guides:
- state SUMO 1.27.1 (another version changes the baseline numbers) and SciPy
  >= 1.11 (older versions approximate the Wilcoxon p-value at n = 30);
- Medenilla Part 2: fresh rng per (setting, metric, controller), baseline drawn
  first, rows sorted by seed, so a correct method matches the answer key;
- Badal Part B: the three surge stops are the first draw of the surge stream;
- add the workplan's EO 3.2 figures: a time-space diagram per disturbance
  member and degradation graphs for Medenilla.

Co-Authored-By: Claude Opus 5.5 <noreply@anthropic.com>
</commit_message>
<xml_diff>
--- a/docs/msa3_member_guides/1_Medenilla_Statistics/B3_Guide_Statistics.docx
+++ b/docs/msa3_member_guides/1_Medenilla_Statistics/B3_Guide_Statistics.docx
@@ -769,7 +769,7 @@
           <w:color w:val="2E4B73"/>
           <w:sz w:val="19"/>
         </w:rPr>
-        <w:t>py -m pip install pandas numpy scipy</w:t>
+        <w:t>py -m pip install pandas numpy matplotlib "scipy&gt;=1.11"</w:t>
       </w:r>
       <w:r>
         <w:rPr>
@@ -779,7 +779,7 @@
           <w:color w:val="1F2933"/>
           <w:sz w:val="22"/>
         </w:rPr>
-        <w:t>.</w:t>
+        <w:t>. The SciPy version matters: older versions estimate the Wilcoxon p-value differently at 30 seeds, so your numbers would not match.</w:t>
       </w:r>
     </w:p>
     <w:p>
@@ -1268,7 +1268,7 @@
           <w:color w:val="1F2933"/>
           <w:sz w:val="22"/>
         </w:rPr>
-        <w:t>one row per seed</w:t>
+        <w:t>one row per seed, sorted from seed 0 to 29</w:t>
       </w:r>
       <w:r>
         <w:rPr>
@@ -1278,7 +1278,7 @@
           <w:color w:val="1F2933"/>
           <w:sz w:val="22"/>
         </w:rPr>
-        <w:t xml:space="preserve"> and </w:t>
+        <w:t xml:space="preserve">, and </w:t>
       </w:r>
       <w:r>
         <w:rPr>
@@ -1318,7 +1318,7 @@
           <w:color w:val="1F2933"/>
           <w:sz w:val="22"/>
         </w:rPr>
-        <w:t xml:space="preserve"> does this.</w:t>
+        <w:t xml:space="preserve"> does this. The seed order matters for Step 5: the bootstrap picks rows by position.</w:t>
       </w:r>
     </w:p>
     <w:p>
@@ -3503,7 +3503,7 @@
           <w:color w:val="1F2933"/>
           <w:sz w:val="22"/>
         </w:rPr>
-        <w:t xml:space="preserve"> (use </w:t>
+        <w:t xml:space="preserve">: for every (setting, metric, controller) make a fresh </w:t>
       </w:r>
       <w:r>
         <w:rPr>
@@ -3513,7 +3513,7 @@
           <w:color w:val="2E4B73"/>
           <w:sz w:val="19"/>
         </w:rPr>
-        <w:t>default_rng(2027)</w:t>
+        <w:t>numpy.random.default_rng(2027)</w:t>
       </w:r>
       <w:r>
         <w:rPr>
@@ -3523,7 +3523,67 @@
           <w:color w:val="1F2933"/>
           <w:sz w:val="22"/>
         </w:rPr>
-        <w:t xml:space="preserve">: one draw for the baseline seeds, one for the disturbance seeds). Save as </w:t>
+        <w:t xml:space="preserve">, draw the </w:t>
+      </w:r>
+      <w:r>
+        <w:rPr>
+          <w:rFonts w:ascii="Calibri" w:hAnsi="Calibri" w:cs="Calibri" w:eastAsia="Calibri"/>
+          <w:b/>
+          <w:i w:val="0"/>
+          <w:color w:val="1F2933"/>
+          <w:sz w:val="22"/>
+        </w:rPr>
+        <w:t>baseline</w:t>
+      </w:r>
+      <w:r>
+        <w:rPr>
+          <w:rFonts w:ascii="Calibri" w:hAnsi="Calibri" w:cs="Calibri" w:eastAsia="Calibri"/>
+          <w:b w:val="0"/>
+          <w:i w:val="0"/>
+          <w:color w:val="1F2933"/>
+          <w:sz w:val="22"/>
+        </w:rPr>
+        <w:t xml:space="preserve"> positions first and the </w:t>
+      </w:r>
+      <w:r>
+        <w:rPr>
+          <w:rFonts w:ascii="Calibri" w:hAnsi="Calibri" w:cs="Calibri" w:eastAsia="Calibri"/>
+          <w:b/>
+          <w:i w:val="0"/>
+          <w:color w:val="1F2933"/>
+          <w:sz w:val="22"/>
+        </w:rPr>
+        <w:t>disturbance</w:t>
+      </w:r>
+      <w:r>
+        <w:rPr>
+          <w:rFonts w:ascii="Calibri" w:hAnsi="Calibri" w:cs="Calibri" w:eastAsia="Calibri"/>
+          <w:b w:val="0"/>
+          <w:i w:val="0"/>
+          <w:color w:val="1F2933"/>
+          <w:sz w:val="22"/>
+        </w:rPr>
+        <w:t xml:space="preserve"> positions second, each as </w:t>
+      </w:r>
+      <w:r>
+        <w:rPr>
+          <w:rFonts w:ascii="Consolas" w:hAnsi="Consolas" w:cs="Consolas" w:eastAsia="Consolas"/>
+          <w:b w:val="0"/>
+          <w:i w:val="0"/>
+          <w:color w:val="2E4B73"/>
+          <w:sz w:val="19"/>
+        </w:rPr>
+        <w:t>rng.integers(0, 30, size=(10000, 30))</w:t>
+      </w:r>
+      <w:r>
+        <w:rPr>
+          <w:rFonts w:ascii="Calibri" w:hAnsi="Calibri" w:cs="Calibri" w:eastAsia="Calibri"/>
+          <w:b w:val="0"/>
+          <w:i w:val="0"/>
+          <w:color w:val="1F2933"/>
+          <w:sz w:val="22"/>
+        </w:rPr>
+        <w:t xml:space="preserve">, with both settings' rows sorted by seed. The ratio for each of the 10,000 rows is mean(disturbance) / mean(baseline); the CI is the 2.5th and 97.5th percentile. Save as </w:t>
       </w:r>
       <w:r>
         <w:rPr>
@@ -3544,6 +3604,62 @@
           <w:sz w:val="22"/>
         </w:rPr>
         <w:t xml:space="preserve"> with columns cell, metric, controller, mean_baseline, mean_cell, ratio, ratio_ci_low, ratio_ci_high.</w:t>
+      </w:r>
+    </w:p>
+    <w:p>
+      <w:pPr>
+        <w:spacing w:after="60" w:line="264" w:lineRule="auto"/>
+        <w:ind w:left="461" w:hanging="288"/>
+      </w:pPr>
+      <w:r>
+        <w:rPr>
+          <w:rFonts w:ascii="Calibri" w:hAnsi="Calibri" w:cs="Calibri" w:eastAsia="Calibri"/>
+          <w:b/>
+          <w:i w:val="0"/>
+          <w:color w:val="1F3B63"/>
+          <w:sz w:val="22"/>
+        </w:rPr>
+        <w:t xml:space="preserve">•  </w:t>
+      </w:r>
+      <w:r>
+        <w:rPr>
+          <w:rFonts w:ascii="Calibri" w:hAnsi="Calibri" w:cs="Calibri" w:eastAsia="Calibri"/>
+          <w:b/>
+          <w:i w:val="0"/>
+          <w:color w:val="1F2933"/>
+          <w:sz w:val="22"/>
+        </w:rPr>
+        <w:t>Degradation graph</w:t>
+      </w:r>
+      <w:r>
+        <w:rPr>
+          <w:rFonts w:ascii="Calibri" w:hAnsi="Calibri" w:cs="Calibri" w:eastAsia="Calibri"/>
+          <w:b w:val="0"/>
+          <w:i w:val="0"/>
+          <w:color w:val="1F2933"/>
+          <w:sz w:val="22"/>
+        </w:rPr>
+        <w:t xml:space="preserve"> (the workplan asks for it): for each disturbance member, one figure per metric with the disturbance levels on the x-axis and the ratio with its 95% CI on the y-axis, NC / FH / EH side by side, and a line at 1.0 (no change). Save as </w:t>
+      </w:r>
+      <w:r>
+        <w:rPr>
+          <w:rFonts w:ascii="Consolas" w:hAnsi="Consolas" w:cs="Consolas" w:eastAsia="Consolas"/>
+          <w:b w:val="0"/>
+          <w:i w:val="0"/>
+          <w:color w:val="2E4B73"/>
+          <w:sz w:val="19"/>
+        </w:rPr>
+        <w:t>outputs/degradation_&lt;member&gt;.png</w:t>
+      </w:r>
+      <w:r>
+        <w:rPr>
+          <w:rFonts w:ascii="Calibri" w:hAnsi="Calibri" w:cs="Calibri" w:eastAsia="Calibri"/>
+          <w:b w:val="0"/>
+          <w:i w:val="0"/>
+          <w:color w:val="1F2933"/>
+          <w:sz w:val="22"/>
+        </w:rPr>
+        <w:t>.</w:t>
       </w:r>
     </w:p>
     <w:p>
@@ -3759,7 +3875,7 @@
           <w:color w:val="1F2933"/>
           <w:sz w:val="22"/>
         </w:rPr>
-        <w:t xml:space="preserve"> the same folder, with the outputs for every setting plus </w:t>
+        <w:t xml:space="preserve"> the same folder, with the outputs for every setting, </w:t>
       </w:r>
       <w:r>
         <w:rPr>
@@ -3779,7 +3895,7 @@
           <w:color w:val="1F2933"/>
           <w:sz w:val="22"/>
         </w:rPr>
-        <w:t>.</w:t>
+        <w:t xml:space="preserve"> and the three degradation graphs.</w:t>
       </w:r>
     </w:p>
     <w:p>

</xml_diff>